<commit_message>
Extend the standard with four more rules and a paragraph-spacing check
- Format table: table content, paragraph spacing (0 before/after), numbering style
- New section: how to mark revisions (black / red strikethrough / blue; MathType kept as-is)
- Default format when there is no template (black only, no italics, no heading styles, no borders, simple grid tables)
- Manual checklist: zero tolerance for stray or missing spaces, mixed CJK/Latin punctuation, abnormal indents
- word_format_check.py: flag non-zero paragraph before/after spacing

Co-Authored-By: Claude Code <noreply@anthropic.com>
</commit_message>
<xml_diff>
--- a/docs/Word文档格式标准与核对流程.docx
+++ b/docs/Word文档格式标准与核对流程.docx
@@ -43,7 +43,7 @@
           <w:sz w:val="21"/>
           <w:szCs w:val="21"/>
         </w:rPr>
-        <w:t xml:space="preserve">本文件把您对 Word 文档的全部要求整理成一份标准（2026 年 10 月 10 日定）。以后凡是给您处理文档，先按这份标准来做，再按核对流程检查；全部通过、您验收满意后，才算完成。这份文件本身也按标准排版，并已通过自动检查。</w:t>
+        <w:t xml:space="preserve">本文件把您对 Word 文档的全部要求整理成一份标准（2026 年 10 月 10 日定，10 月 12 日更新）。以后凡是给您处理文档，先按这份标准来做，再按核对流程检查；全部通过、您验收满意后，才算完成。这份文件本身也按标准排版，并已通过自动检查。</w:t>
       </w:r>
     </w:p>
     <w:p>
@@ -575,7 +575,7 @@
                 <w:sz w:val="18"/>
                 <w:szCs w:val="18"/>
               </w:rPr>
-              <w:t xml:space="preserve">参考文献</w:t>
+              <w:t xml:space="preserve">表格内容</w:t>
             </w:r>
           </w:p>
         </w:tc>
@@ -600,7 +600,7 @@
                 <w:sz w:val="18"/>
                 <w:szCs w:val="18"/>
               </w:rPr>
-              <w:t xml:space="preserve">小五（9 磅）、悬挂缩进 2 字符</w:t>
+              <w:t xml:space="preserve">小五（9 磅）、居中；每个单元格尽量一行</w:t>
             </w:r>
           </w:p>
         </w:tc>
@@ -627,7 +627,7 @@
                 <w:sz w:val="18"/>
                 <w:szCs w:val="18"/>
               </w:rPr>
-              <w:t xml:space="preserve">全文行距</w:t>
+              <w:t xml:space="preserve">参考文献</w:t>
             </w:r>
           </w:p>
         </w:tc>
@@ -652,7 +652,7 @@
                 <w:sz w:val="18"/>
                 <w:szCs w:val="18"/>
               </w:rPr>
-              <w:t xml:space="preserve">单倍行距</w:t>
+              <w:t xml:space="preserve">小五（9 磅）、悬挂缩进 2 字符</w:t>
             </w:r>
           </w:p>
         </w:tc>
@@ -679,7 +679,7 @@
                 <w:sz w:val="18"/>
                 <w:szCs w:val="18"/>
               </w:rPr>
-              <w:t xml:space="preserve">显示公式</w:t>
+              <w:t xml:space="preserve">全文行距</w:t>
             </w:r>
           </w:p>
         </w:tc>
@@ -704,7 +704,7 @@
                 <w:sz w:val="18"/>
                 <w:szCs w:val="18"/>
               </w:rPr>
-              <w:t xml:space="preserve">公式居中；编号手动输入顶到右侧（编号不放进公式内部）</w:t>
+              <w:t xml:space="preserve">单倍行距</w:t>
             </w:r>
           </w:p>
         </w:tc>
@@ -731,6 +731,162 @@
                 <w:sz w:val="18"/>
                 <w:szCs w:val="18"/>
               </w:rPr>
+              <w:t xml:space="preserve">段落间距</w:t>
+            </w:r>
+          </w:p>
+        </w:tc>
+        <w:tc>
+          <w:tcPr>
+            <w:tcW w:w="5706" w:type="dxa"/>
+          </w:tcPr>
+          <w:p>
+            <w:pPr>
+              <w:spacing w:line="240" w:lineRule="auto"/>
+              <w:ind w:firstLineChars="0" w:firstLine="0"/>
+              <w:jc w:val="center"/>
+              <w:rPr>
+                <w:rFonts w:ascii="Times New Roman" w:hAnsi="Times New Roman" w:eastAsia="宋体" w:cs="Times New Roman"/>
+                <w:sz w:val="18"/>
+                <w:szCs w:val="18"/>
+              </w:rPr>
+            </w:pPr>
+            <w:r>
+              <w:rPr>
+                <w:rFonts w:ascii="Times New Roman" w:hAnsi="Times New Roman" w:eastAsia="宋体" w:cs="Times New Roman"/>
+                <w:sz w:val="18"/>
+                <w:szCs w:val="18"/>
+              </w:rPr>
+              <w:t xml:space="preserve">段前、段后都是 0 行</w:t>
+            </w:r>
+          </w:p>
+        </w:tc>
+      </w:tr>
+      <w:tr>
+        <w:tc>
+          <w:tcPr>
+            <w:tcW w:w="2600" w:type="dxa"/>
+          </w:tcPr>
+          <w:p>
+            <w:pPr>
+              <w:spacing w:line="240" w:lineRule="auto"/>
+              <w:ind w:firstLineChars="0" w:firstLine="0"/>
+              <w:jc w:val="center"/>
+              <w:rPr>
+                <w:rFonts w:ascii="Times New Roman" w:hAnsi="Times New Roman" w:eastAsia="宋体" w:cs="Times New Roman"/>
+                <w:sz w:val="18"/>
+                <w:szCs w:val="18"/>
+              </w:rPr>
+            </w:pPr>
+            <w:r>
+              <w:rPr>
+                <w:rFonts w:ascii="Times New Roman" w:hAnsi="Times New Roman" w:eastAsia="宋体" w:cs="Times New Roman"/>
+                <w:sz w:val="18"/>
+                <w:szCs w:val="18"/>
+              </w:rPr>
+              <w:t xml:space="preserve">编号</w:t>
+            </w:r>
+          </w:p>
+        </w:tc>
+        <w:tc>
+          <w:tcPr>
+            <w:tcW w:w="5706" w:type="dxa"/>
+          </w:tcPr>
+          <w:p>
+            <w:pPr>
+              <w:spacing w:line="240" w:lineRule="auto"/>
+              <w:ind w:firstLineChars="0" w:firstLine="0"/>
+              <w:jc w:val="center"/>
+              <w:rPr>
+                <w:rFonts w:ascii="Times New Roman" w:hAnsi="Times New Roman" w:eastAsia="宋体" w:cs="Times New Roman"/>
+                <w:sz w:val="18"/>
+                <w:szCs w:val="18"/>
+              </w:rPr>
+            </w:pPr>
+            <w:r>
+              <w:rPr>
+                <w:rFonts w:ascii="Times New Roman" w:hAnsi="Times New Roman" w:eastAsia="宋体" w:cs="Times New Roman"/>
+                <w:sz w:val="18"/>
+                <w:szCs w:val="18"/>
+              </w:rPr>
+              <w:t xml:space="preserve">用"1."式编号，少用圆圈数字①②③</w:t>
+            </w:r>
+          </w:p>
+        </w:tc>
+      </w:tr>
+      <w:tr>
+        <w:tc>
+          <w:tcPr>
+            <w:tcW w:w="2600" w:type="dxa"/>
+          </w:tcPr>
+          <w:p>
+            <w:pPr>
+              <w:spacing w:line="240" w:lineRule="auto"/>
+              <w:ind w:firstLineChars="0" w:firstLine="0"/>
+              <w:jc w:val="center"/>
+              <w:rPr>
+                <w:rFonts w:ascii="Times New Roman" w:hAnsi="Times New Roman" w:eastAsia="宋体" w:cs="Times New Roman"/>
+                <w:sz w:val="18"/>
+                <w:szCs w:val="18"/>
+              </w:rPr>
+            </w:pPr>
+            <w:r>
+              <w:rPr>
+                <w:rFonts w:ascii="Times New Roman" w:hAnsi="Times New Roman" w:eastAsia="宋体" w:cs="Times New Roman"/>
+                <w:sz w:val="18"/>
+                <w:szCs w:val="18"/>
+              </w:rPr>
+              <w:t xml:space="preserve">显示公式</w:t>
+            </w:r>
+          </w:p>
+        </w:tc>
+        <w:tc>
+          <w:tcPr>
+            <w:tcW w:w="5706" w:type="dxa"/>
+          </w:tcPr>
+          <w:p>
+            <w:pPr>
+              <w:spacing w:line="240" w:lineRule="auto"/>
+              <w:ind w:firstLineChars="0" w:firstLine="0"/>
+              <w:jc w:val="center"/>
+              <w:rPr>
+                <w:rFonts w:ascii="Times New Roman" w:hAnsi="Times New Roman" w:eastAsia="宋体" w:cs="Times New Roman"/>
+                <w:sz w:val="18"/>
+                <w:szCs w:val="18"/>
+              </w:rPr>
+            </w:pPr>
+            <w:r>
+              <w:rPr>
+                <w:rFonts w:ascii="Times New Roman" w:hAnsi="Times New Roman" w:eastAsia="宋体" w:cs="Times New Roman"/>
+                <w:sz w:val="18"/>
+                <w:szCs w:val="18"/>
+              </w:rPr>
+              <w:t xml:space="preserve">公式居中；编号手动输入顶到右侧（编号不放进公式内部）</w:t>
+            </w:r>
+          </w:p>
+        </w:tc>
+      </w:tr>
+      <w:tr>
+        <w:tc>
+          <w:tcPr>
+            <w:tcW w:w="2600" w:type="dxa"/>
+          </w:tcPr>
+          <w:p>
+            <w:pPr>
+              <w:spacing w:line="240" w:lineRule="auto"/>
+              <w:ind w:firstLineChars="0" w:firstLine="0"/>
+              <w:jc w:val="center"/>
+              <w:rPr>
+                <w:rFonts w:ascii="Times New Roman" w:hAnsi="Times New Roman" w:eastAsia="宋体" w:cs="Times New Roman"/>
+                <w:sz w:val="18"/>
+                <w:szCs w:val="18"/>
+              </w:rPr>
+            </w:pPr>
+            <w:r>
+              <w:rPr>
+                <w:rFonts w:ascii="Times New Roman" w:hAnsi="Times New Roman" w:eastAsia="宋体" w:cs="Times New Roman"/>
+                <w:sz w:val="18"/>
+                <w:szCs w:val="18"/>
+              </w:rPr>
               <w:t xml:space="preserve">文字中的公式符号</w:t>
             </w:r>
           </w:p>
@@ -765,6 +921,26 @@
     <w:p>
       <w:pPr>
         <w:spacing w:line="240" w:lineRule="auto"/>
+        <w:ind w:firstLineChars="200" w:firstLine="420"/>
+        <w:jc w:val="both"/>
+        <w:rPr>
+          <w:rFonts w:ascii="Times New Roman" w:hAnsi="Times New Roman" w:eastAsia="宋体" w:cs="Times New Roman"/>
+          <w:sz w:val="21"/>
+          <w:szCs w:val="21"/>
+        </w:rPr>
+      </w:pPr>
+      <w:r>
+        <w:rPr>
+          <w:rFonts w:ascii="Times New Roman" w:hAnsi="Times New Roman" w:eastAsia="宋体" w:cs="Times New Roman"/>
+          <w:sz w:val="21"/>
+          <w:szCs w:val="21"/>
+        </w:rPr>
+        <w:t xml:space="preserve">没有现成模板时按默认格式来：只用黑字；正文不倾斜、不用 Word 标题样式、不加边框底纹；表格用最简网格。</w:t>
+      </w:r>
+    </w:p>
+    <w:p>
+      <w:pPr>
+        <w:spacing w:line="240" w:lineRule="auto"/>
         <w:ind w:firstLineChars="0" w:firstLine="0"/>
         <w:rPr>
           <w:rFonts w:ascii="Times New Roman" w:hAnsi="Times New Roman" w:eastAsia="宋体" w:cs="Times New Roman"/>
@@ -885,188 +1061,27 @@
           <w:sz w:val="21"/>
           <w:szCs w:val="21"/>
         </w:rPr>
-        <w:t xml:space="preserve">四、核对流程（每一步都要过）</w:t>
-      </w:r>
-    </w:p>
-    <w:p>
-      <w:pPr>
-        <w:spacing w:line="240" w:lineRule="auto"/>
-        <w:ind w:firstLineChars="200" w:firstLine="420"/>
-        <w:jc w:val="both"/>
-        <w:rPr>
-          <w:rFonts w:ascii="Times New Roman" w:hAnsi="Times New Roman" w:eastAsia="宋体" w:cs="Times New Roman"/>
-          <w:sz w:val="21"/>
-          <w:szCs w:val="21"/>
-        </w:rPr>
-      </w:pPr>
-      <w:r>
-        <w:rPr>
-          <w:rFonts w:ascii="Times New Roman" w:hAnsi="Times New Roman" w:eastAsia="宋体" w:cs="Times New Roman"/>
-          <w:sz w:val="21"/>
-          <w:szCs w:val="21"/>
-        </w:rPr>
-        <w:t xml:space="preserve">第 0 步 备份：改动前先把原文件复制一份，备份名字包含"改动说明 + 日期"。</w:t>
-      </w:r>
-    </w:p>
-    <w:p>
-      <w:pPr>
-        <w:spacing w:line="240" w:lineRule="auto"/>
-        <w:ind w:firstLineChars="200" w:firstLine="420"/>
-        <w:jc w:val="both"/>
-        <w:rPr>
-          <w:rFonts w:ascii="Times New Roman" w:hAnsi="Times New Roman" w:eastAsia="宋体" w:cs="Times New Roman"/>
-          <w:sz w:val="21"/>
-          <w:szCs w:val="21"/>
-        </w:rPr>
-      </w:pPr>
-      <w:r>
-        <w:rPr>
-          <w:rFonts w:ascii="Times New Roman" w:hAnsi="Times New Roman" w:eastAsia="宋体" w:cs="Times New Roman"/>
-          <w:sz w:val="21"/>
-          <w:szCs w:val="21"/>
-        </w:rPr>
-        <w:t xml:space="preserve">第 1 步 自动检查：运行格式检查程序（由我操作，您不用管），把字体、字号、行距、缩进、标题、题注、注行、表格、公式对象尺寸逐项过一遍。输出"[全部通过]"才算过关；有任何一条问题都要修好、重新检查，直到全绿。</w:t>
-      </w:r>
-    </w:p>
-    <w:p>
-      <w:pPr>
-        <w:spacing w:line="240" w:lineRule="auto"/>
-        <w:ind w:firstLineChars="200" w:firstLine="420"/>
-        <w:jc w:val="both"/>
-        <w:rPr>
-          <w:rFonts w:ascii="Times New Roman" w:hAnsi="Times New Roman" w:eastAsia="宋体" w:cs="Times New Roman"/>
-          <w:sz w:val="21"/>
-          <w:szCs w:val="21"/>
-        </w:rPr>
-      </w:pPr>
-      <w:r>
-        <w:rPr>
-          <w:rFonts w:ascii="Times New Roman" w:hAnsi="Times New Roman" w:eastAsia="宋体" w:cs="Times New Roman"/>
-          <w:sz w:val="21"/>
-          <w:szCs w:val="21"/>
-        </w:rPr>
-        <w:t xml:space="preserve">第 2 步 公式符号专项测量：凡改动涉及公式符号，把文档导出成 PDF，用测量程序逐个比对符号与文字的上下位置。全部偏差不超过 0.5 磅、符号大小等于所在段落字号，才算过关。</w:t>
-      </w:r>
-    </w:p>
-    <w:p>
-      <w:pPr>
-        <w:spacing w:line="240" w:lineRule="auto"/>
-        <w:ind w:firstLineChars="200" w:firstLine="420"/>
-        <w:jc w:val="both"/>
-        <w:rPr>
-          <w:rFonts w:ascii="Times New Roman" w:hAnsi="Times New Roman" w:eastAsia="宋体" w:cs="Times New Roman"/>
-          <w:sz w:val="21"/>
-          <w:szCs w:val="21"/>
-        </w:rPr>
-      </w:pPr>
-      <w:r>
-        <w:rPr>
-          <w:rFonts w:ascii="Times New Roman" w:hAnsi="Times New Roman" w:eastAsia="宋体" w:cs="Times New Roman"/>
-          <w:sz w:val="21"/>
-          <w:szCs w:val="21"/>
-        </w:rPr>
-        <w:t xml:space="preserve">第 3 步 人工逐项核对（分成四遍做，每遍只看几项，看完一遍再看下一遍——一次看太多容易漏）：</w:t>
-      </w:r>
-    </w:p>
-    <w:p>
-      <w:pPr>
-        <w:spacing w:line="240" w:lineRule="auto"/>
-        <w:ind w:firstLineChars="200" w:firstLine="420"/>
-        <w:jc w:val="both"/>
-        <w:rPr>
-          <w:rFonts w:ascii="Times New Roman" w:hAnsi="Times New Roman" w:eastAsia="宋体" w:cs="Times New Roman"/>
-          <w:sz w:val="21"/>
-          <w:szCs w:val="21"/>
-        </w:rPr>
-      </w:pPr>
-      <w:r>
-        <w:rPr>
-          <w:rFonts w:ascii="Times New Roman" w:hAnsi="Times New Roman" w:eastAsia="宋体" w:cs="Times New Roman"/>
-          <w:sz w:val="21"/>
-          <w:szCs w:val="21"/>
-        </w:rPr>
-        <w:t xml:space="preserve">第一遍（字体字号）：□ 题目二号、加粗、居中；□ 正文五号；□ 标题五号、加粗、顶格；□ 图表内文字与题注小五。</w:t>
-      </w:r>
-    </w:p>
-    <w:p>
-      <w:pPr>
-        <w:spacing w:line="240" w:lineRule="auto"/>
-        <w:ind w:firstLineChars="200" w:firstLine="420"/>
-        <w:jc w:val="both"/>
-        <w:rPr>
-          <w:rFonts w:ascii="Times New Roman" w:hAnsi="Times New Roman" w:eastAsia="宋体" w:cs="Times New Roman"/>
-          <w:sz w:val="21"/>
-          <w:szCs w:val="21"/>
-        </w:rPr>
-      </w:pPr>
-      <w:r>
-        <w:rPr>
-          <w:rFonts w:ascii="Times New Roman" w:hAnsi="Times New Roman" w:eastAsia="宋体" w:cs="Times New Roman"/>
-          <w:sz w:val="21"/>
-          <w:szCs w:val="21"/>
-        </w:rPr>
-        <w:t xml:space="preserve">第二遍（段落版式）：□ 正文每段开头空两格、两端对齐；□ 全文单倍行距、行距均匀；□ 图表下的注靠左、不缩进；□ 参考文献小五、悬挂缩进 2 字符。</w:t>
-      </w:r>
-    </w:p>
-    <w:p>
-      <w:pPr>
-        <w:spacing w:line="240" w:lineRule="auto"/>
-        <w:ind w:firstLineChars="200" w:firstLine="420"/>
-        <w:jc w:val="both"/>
-        <w:rPr>
-          <w:rFonts w:ascii="Times New Roman" w:hAnsi="Times New Roman" w:eastAsia="宋体" w:cs="Times New Roman"/>
-          <w:sz w:val="21"/>
-          <w:szCs w:val="21"/>
-        </w:rPr>
-      </w:pPr>
-      <w:r>
-        <w:rPr>
-          <w:rFonts w:ascii="Times New Roman" w:hAnsi="Times New Roman" w:eastAsia="宋体" w:cs="Times New Roman"/>
-          <w:sz w:val="21"/>
-          <w:szCs w:val="21"/>
-        </w:rPr>
-        <w:t xml:space="preserve">第三遍（公式专项）：□ 公式居中、编号顶右、不重复、公式内部无多余编号；□ 行内公式符号与文字同字号、不偏上不偏下（配合导出 PDF 检查，偏差 ≤ 0.5 磅）。</w:t>
-      </w:r>
-    </w:p>
-    <w:p>
-      <w:pPr>
-        <w:spacing w:line="240" w:lineRule="auto"/>
-        <w:ind w:firstLineChars="200" w:firstLine="420"/>
-        <w:jc w:val="both"/>
-        <w:rPr>
-          <w:rFonts w:ascii="Times New Roman" w:hAnsi="Times New Roman" w:eastAsia="宋体" w:cs="Times New Roman"/>
-          <w:sz w:val="21"/>
-          <w:szCs w:val="21"/>
-        </w:rPr>
-      </w:pPr>
-      <w:r>
-        <w:rPr>
-          <w:rFonts w:ascii="Times New Roman" w:hAnsi="Times New Roman" w:eastAsia="宋体" w:cs="Times New Roman"/>
-          <w:sz w:val="21"/>
-          <w:szCs w:val="21"/>
-        </w:rPr>
-        <w:t xml:space="preserve">第四遍（整体通读）：□ 从头翻到尾：没有多余空白页、没有串行、没有乱码；□ 页码连续；□ 图表都在页面居中。</w:t>
-      </w:r>
-    </w:p>
-    <w:p>
-      <w:pPr>
-        <w:keepLines/>
-        <w:spacing w:line="240" w:lineRule="auto"/>
-        <w:ind w:firstLineChars="200" w:firstLine="420"/>
-        <w:jc w:val="both"/>
-        <w:rPr>
-          <w:rFonts w:ascii="Times New Roman" w:hAnsi="Times New Roman" w:eastAsia="宋体" w:cs="Times New Roman"/>
-          <w:sz w:val="21"/>
-          <w:szCs w:val="21"/>
-        </w:rPr>
-      </w:pPr>
-      <w:r>
-        <w:rPr>
-          <w:rFonts w:ascii="Times New Roman" w:hAnsi="Times New Roman" w:eastAsia="宋体" w:cs="Times New Roman"/>
-          <w:sz w:val="21"/>
-          <w:szCs w:val="21"/>
-        </w:rPr>
-        <w:t xml:space="preserve">第 4 步 交付与验收：向您报告做了什么、结果如何、备份在哪里；您验收满意后，中间文件和过程备份由我自行清理（只留"原始 + 最新"，走回收站并给您清单）。</w:t>
+        <w:t xml:space="preserve">四、修改稿怎么标记</w:t>
+      </w:r>
+    </w:p>
+    <w:p>
+      <w:pPr>
+        <w:spacing w:line="240" w:lineRule="auto"/>
+        <w:ind w:firstLineChars="200" w:firstLine="420"/>
+        <w:jc w:val="both"/>
+        <w:rPr>
+          <w:rFonts w:ascii="Times New Roman" w:hAnsi="Times New Roman" w:eastAsia="宋体" w:cs="Times New Roman"/>
+          <w:sz w:val="21"/>
+          <w:szCs w:val="21"/>
+        </w:rPr>
+      </w:pPr>
+      <w:r>
+        <w:rPr>
+          <w:rFonts w:ascii="Times New Roman" w:hAnsi="Times New Roman" w:eastAsia="宋体" w:cs="Times New Roman"/>
+          <w:sz w:val="21"/>
+          <w:szCs w:val="21"/>
+        </w:rPr>
+        <w:t xml:space="preserve">手动上色标记，不用 Word 修订模式：保留的内容保持黑色；删除的内容改成红色并加删除线；新增的内容用蓝色。公式保持 MathType 本体，不转成图片；公式内部不加标记，只把公式编号标蓝。</w:t>
       </w:r>
     </w:p>
     <w:p>
@@ -1089,7 +1104,167 @@
           <w:sz w:val="21"/>
           <w:szCs w:val="21"/>
         </w:rPr>
-        <w:t xml:space="preserve">五、常用工具与文件位置</w:t>
+        <w:t xml:space="preserve">五、核对流程（每一步都要过）</w:t>
+      </w:r>
+    </w:p>
+    <w:p>
+      <w:pPr>
+        <w:spacing w:line="240" w:lineRule="auto"/>
+        <w:ind w:firstLineChars="200" w:firstLine="420"/>
+        <w:jc w:val="both"/>
+        <w:rPr>
+          <w:rFonts w:ascii="Times New Roman" w:hAnsi="Times New Roman" w:eastAsia="宋体" w:cs="Times New Roman"/>
+          <w:sz w:val="21"/>
+          <w:szCs w:val="21"/>
+        </w:rPr>
+      </w:pPr>
+      <w:r>
+        <w:rPr>
+          <w:rFonts w:ascii="Times New Roman" w:hAnsi="Times New Roman" w:eastAsia="宋体" w:cs="Times New Roman"/>
+          <w:sz w:val="21"/>
+          <w:szCs w:val="21"/>
+        </w:rPr>
+        <w:t xml:space="preserve">第 0 步 备份：改动前先把原文件复制一份，备份名字包含"改动说明 + 日期"。</w:t>
+      </w:r>
+    </w:p>
+    <w:p>
+      <w:pPr>
+        <w:spacing w:line="240" w:lineRule="auto"/>
+        <w:ind w:firstLineChars="200" w:firstLine="420"/>
+        <w:jc w:val="both"/>
+        <w:rPr>
+          <w:rFonts w:ascii="Times New Roman" w:hAnsi="Times New Roman" w:eastAsia="宋体" w:cs="Times New Roman"/>
+          <w:sz w:val="21"/>
+          <w:szCs w:val="21"/>
+        </w:rPr>
+      </w:pPr>
+      <w:r>
+        <w:rPr>
+          <w:rFonts w:ascii="Times New Roman" w:hAnsi="Times New Roman" w:eastAsia="宋体" w:cs="Times New Roman"/>
+          <w:sz w:val="21"/>
+          <w:szCs w:val="21"/>
+        </w:rPr>
+        <w:t xml:space="preserve">第 1 步 自动检查：运行格式检查程序（由我操作，您不用管），把字体、字号、行距、段前段后（段距）、缩进、标题、题注、注行、表格、公式对象尺寸逐项过一遍。输出"[全部通过]"才算过关；有任何一条问题都要修好、重新检查，直到全绿。</w:t>
+      </w:r>
+    </w:p>
+    <w:p>
+      <w:pPr>
+        <w:spacing w:line="240" w:lineRule="auto"/>
+        <w:ind w:firstLineChars="200" w:firstLine="420"/>
+        <w:jc w:val="both"/>
+        <w:rPr>
+          <w:rFonts w:ascii="Times New Roman" w:hAnsi="Times New Roman" w:eastAsia="宋体" w:cs="Times New Roman"/>
+          <w:sz w:val="21"/>
+          <w:szCs w:val="21"/>
+        </w:rPr>
+      </w:pPr>
+      <w:r>
+        <w:rPr>
+          <w:rFonts w:ascii="Times New Roman" w:hAnsi="Times New Roman" w:eastAsia="宋体" w:cs="Times New Roman"/>
+          <w:sz w:val="21"/>
+          <w:szCs w:val="21"/>
+        </w:rPr>
+        <w:t xml:space="preserve">第 2 步 公式符号专项测量：凡改动涉及公式符号，把文档导出成 PDF，用测量程序逐个比对符号与文字的上下位置。全部偏差不超过 0.5 磅、符号大小等于所在段落字号，才算过关。</w:t>
+      </w:r>
+    </w:p>
+    <w:p>
+      <w:pPr>
+        <w:spacing w:line="240" w:lineRule="auto"/>
+        <w:ind w:firstLineChars="200" w:firstLine="420"/>
+        <w:jc w:val="both"/>
+        <w:rPr>
+          <w:rFonts w:ascii="Times New Roman" w:hAnsi="Times New Roman" w:eastAsia="宋体" w:cs="Times New Roman"/>
+          <w:sz w:val="21"/>
+          <w:szCs w:val="21"/>
+        </w:rPr>
+      </w:pPr>
+      <w:r>
+        <w:rPr>
+          <w:rFonts w:ascii="Times New Roman" w:hAnsi="Times New Roman" w:eastAsia="宋体" w:cs="Times New Roman"/>
+          <w:sz w:val="21"/>
+          <w:szCs w:val="21"/>
+        </w:rPr>
+        <w:t xml:space="preserve">第 3 步 人工逐项核对（分成四遍做，每遍只看几项，看完一遍再看下一遍——一次看太多容易漏）：</w:t>
+      </w:r>
+    </w:p>
+    <w:p>
+      <w:pPr>
+        <w:spacing w:line="240" w:lineRule="auto"/>
+        <w:ind w:firstLineChars="200" w:firstLine="420"/>
+        <w:jc w:val="both"/>
+        <w:rPr>
+          <w:rFonts w:ascii="Times New Roman" w:hAnsi="Times New Roman" w:eastAsia="宋体" w:cs="Times New Roman"/>
+          <w:sz w:val="21"/>
+          <w:szCs w:val="21"/>
+        </w:rPr>
+      </w:pPr>
+      <w:r>
+        <w:rPr>
+          <w:rFonts w:ascii="Times New Roman" w:hAnsi="Times New Roman" w:eastAsia="宋体" w:cs="Times New Roman"/>
+          <w:sz w:val="21"/>
+          <w:szCs w:val="21"/>
+        </w:rPr>
+        <w:t xml:space="preserve">第一遍（字体字号）：□ 题目二号、加粗、居中；□ 正文五号；□ 标题五号、加粗、顶格；□ 图表内文字与题注小五。</w:t>
+      </w:r>
+    </w:p>
+    <w:p>
+      <w:pPr>
+        <w:spacing w:line="240" w:lineRule="auto"/>
+        <w:ind w:firstLineChars="200" w:firstLine="420"/>
+        <w:jc w:val="both"/>
+        <w:rPr>
+          <w:rFonts w:ascii="Times New Roman" w:hAnsi="Times New Roman" w:eastAsia="宋体" w:cs="Times New Roman"/>
+          <w:sz w:val="21"/>
+          <w:szCs w:val="21"/>
+        </w:rPr>
+      </w:pPr>
+      <w:r>
+        <w:rPr>
+          <w:rFonts w:ascii="Times New Roman" w:hAnsi="Times New Roman" w:eastAsia="宋体" w:cs="Times New Roman"/>
+          <w:sz w:val="21"/>
+          <w:szCs w:val="21"/>
+        </w:rPr>
+        <w:t xml:space="preserve">第二遍（段落版式）：□ 正文每段开头空两格、两端对齐；□ 全文单倍行距、行距均匀；□ 图表下的注靠左、不缩进；□ 参考文献小五、悬挂缩进 2 字符。</w:t>
+      </w:r>
+    </w:p>
+    <w:p>
+      <w:pPr>
+        <w:spacing w:line="240" w:lineRule="auto"/>
+        <w:ind w:firstLineChars="200" w:firstLine="420"/>
+        <w:jc w:val="both"/>
+        <w:rPr>
+          <w:rFonts w:ascii="Times New Roman" w:hAnsi="Times New Roman" w:eastAsia="宋体" w:cs="Times New Roman"/>
+          <w:sz w:val="21"/>
+          <w:szCs w:val="21"/>
+        </w:rPr>
+      </w:pPr>
+      <w:r>
+        <w:rPr>
+          <w:rFonts w:ascii="Times New Roman" w:hAnsi="Times New Roman" w:eastAsia="宋体" w:cs="Times New Roman"/>
+          <w:sz w:val="21"/>
+          <w:szCs w:val="21"/>
+        </w:rPr>
+        <w:t xml:space="preserve">第三遍（公式专项）：□ 公式居中、编号顶右、不重复、公式内部无多余编号；□ 行内公式符号与文字同字号、不偏上不偏下（配合导出 PDF 检查，偏差 ≤ 0.5 磅）。</w:t>
+      </w:r>
+    </w:p>
+    <w:p>
+      <w:pPr>
+        <w:spacing w:line="240" w:lineRule="auto"/>
+        <w:ind w:firstLineChars="200" w:firstLine="420"/>
+        <w:jc w:val="both"/>
+        <w:rPr>
+          <w:rFonts w:ascii="Times New Roman" w:hAnsi="Times New Roman" w:eastAsia="宋体" w:cs="Times New Roman"/>
+          <w:sz w:val="21"/>
+          <w:szCs w:val="21"/>
+        </w:rPr>
+      </w:pPr>
+      <w:r>
+        <w:rPr>
+          <w:rFonts w:ascii="Times New Roman" w:hAnsi="Times New Roman" w:eastAsia="宋体" w:cs="Times New Roman"/>
+          <w:sz w:val="21"/>
+          <w:szCs w:val="21"/>
+        </w:rPr>
+        <w:t xml:space="preserve">第四遍（整体通读）：□ 从头翻到尾：没有多余空白页、没有串行、没有乱码；□ 页码连续；□ 图表都在页面居中；□ 低级错零容忍——没有多余或缺失的空格，中英文标点没有混用，缩进没有异常。</w:t>
       </w:r>
     </w:p>
     <w:p>
@@ -1110,87 +1285,7 @@
           <w:sz w:val="21"/>
           <w:szCs w:val="21"/>
         </w:rPr>
-        <w:t xml:space="preserve">格式检查程序：~\.claude\tools\word_format_check.py（对任意 Word 文件都能运行）。</w:t>
-      </w:r>
-    </w:p>
-    <w:p>
-      <w:pPr>
-        <w:spacing w:line="240" w:lineRule="auto"/>
-        <w:ind w:firstLineChars="200" w:firstLine="420"/>
-        <w:jc w:val="both"/>
-        <w:rPr>
-          <w:rFonts w:ascii="Times New Roman" w:hAnsi="Times New Roman" w:eastAsia="宋体" w:cs="Times New Roman"/>
-          <w:sz w:val="21"/>
-          <w:szCs w:val="21"/>
-        </w:rPr>
-      </w:pPr>
-      <w:r>
-        <w:rPr>
-          <w:rFonts w:ascii="Times New Roman" w:hAnsi="Times New Roman" w:eastAsia="宋体" w:cs="Times New Roman"/>
-          <w:sz w:val="21"/>
-          <w:szCs w:val="21"/>
-        </w:rPr>
-        <w:t xml:space="preserve">公式符号测量程序：~\.claude\tools\word_symbol_align_check.py（把文档导出 PDF 后运行，检查符号位置偏差）。</w:t>
-      </w:r>
-    </w:p>
-    <w:p>
-      <w:pPr>
-        <w:spacing w:line="240" w:lineRule="auto"/>
-        <w:ind w:firstLineChars="200" w:firstLine="420"/>
-        <w:jc w:val="both"/>
-        <w:rPr>
-          <w:rFonts w:ascii="Times New Roman" w:hAnsi="Times New Roman" w:eastAsia="宋体" w:cs="Times New Roman"/>
-          <w:sz w:val="21"/>
-          <w:szCs w:val="21"/>
-        </w:rPr>
-      </w:pPr>
-      <w:r>
-        <w:rPr>
-          <w:rFonts w:ascii="Times New Roman" w:hAnsi="Times New Roman" w:eastAsia="宋体" w:cs="Times New Roman"/>
-          <w:sz w:val="21"/>
-          <w:szCs w:val="21"/>
-        </w:rPr>
-        <w:t xml:space="preserve">公式符号大小修复程序：~\.claude\tools\word_inline_eq_resize.py（需要时使用）。</w:t>
-      </w:r>
-    </w:p>
-    <w:p>
-      <w:pPr>
-        <w:spacing w:line="240" w:lineRule="auto"/>
-        <w:ind w:firstLineChars="200" w:firstLine="420"/>
-        <w:jc w:val="both"/>
-        <w:rPr>
-          <w:rFonts w:ascii="Times New Roman" w:hAnsi="Times New Roman" w:eastAsia="宋体" w:cs="Times New Roman"/>
-          <w:sz w:val="21"/>
-          <w:szCs w:val="21"/>
-        </w:rPr>
-      </w:pPr>
-      <w:r>
-        <w:rPr>
-          <w:rFonts w:ascii="Times New Roman" w:hAnsi="Times New Roman" w:eastAsia="宋体" w:cs="Times New Roman"/>
-          <w:sz w:val="21"/>
-          <w:szCs w:val="21"/>
-        </w:rPr>
-        <w:t xml:space="preserve">个人习惯档案：~\.claude\user-profile\（说话习惯、词语小词典、图片偏好、任务习惯四本，每次对话自动加载）。</w:t>
-      </w:r>
-    </w:p>
-    <w:p>
-      <w:pPr>
-        <w:spacing w:line="240" w:lineRule="auto"/>
-        <w:ind w:firstLineChars="200" w:firstLine="420"/>
-        <w:jc w:val="both"/>
-        <w:rPr>
-          <w:rFonts w:ascii="Times New Roman" w:hAnsi="Times New Roman" w:eastAsia="宋体" w:cs="Times New Roman"/>
-          <w:sz w:val="21"/>
-          <w:szCs w:val="21"/>
-        </w:rPr>
-      </w:pPr>
-      <w:r>
-        <w:rPr>
-          <w:rFonts w:ascii="Times New Roman" w:hAnsi="Times New Roman" w:eastAsia="宋体" w:cs="Times New Roman"/>
-          <w:sz w:val="21"/>
-          <w:szCs w:val="21"/>
-        </w:rPr>
-        <w:t xml:space="preserve">你的文档文件夹（每次改动前都会备份）。</w:t>
+        <w:t xml:space="preserve">第 4 步 交付与验收：向您报告做了什么、结果如何、备份在哪里；您验收满意后，中间文件和过程备份由我自行清理（只留"原始 + 最新"，走回收站并给您清单）。</w:t>
       </w:r>
     </w:p>
     <w:p>
@@ -1213,7 +1308,131 @@
           <w:sz w:val="21"/>
           <w:szCs w:val="21"/>
         </w:rPr>
-        <w:t xml:space="preserve">六、还没有特别规定的事项（您可以随时补充，我再加进标准）</w:t>
+        <w:t xml:space="preserve">六、常用工具与文件位置</w:t>
+      </w:r>
+    </w:p>
+    <w:p>
+      <w:pPr>
+        <w:keepLines/>
+        <w:spacing w:line="240" w:lineRule="auto"/>
+        <w:ind w:firstLineChars="200" w:firstLine="420"/>
+        <w:jc w:val="both"/>
+        <w:rPr>
+          <w:rFonts w:ascii="Times New Roman" w:hAnsi="Times New Roman" w:eastAsia="宋体" w:cs="Times New Roman"/>
+          <w:sz w:val="21"/>
+          <w:szCs w:val="21"/>
+        </w:rPr>
+      </w:pPr>
+      <w:r>
+        <w:rPr>
+          <w:rFonts w:ascii="Times New Roman" w:hAnsi="Times New Roman" w:eastAsia="宋体" w:cs="Times New Roman"/>
+          <w:sz w:val="21"/>
+          <w:szCs w:val="21"/>
+        </w:rPr>
+        <w:t xml:space="preserve">格式检查程序：~\.claude\tools\word_format_check.py（对任意 Word 文件都能运行）。</w:t>
+      </w:r>
+    </w:p>
+    <w:p>
+      <w:pPr>
+        <w:spacing w:line="240" w:lineRule="auto"/>
+        <w:ind w:firstLineChars="200" w:firstLine="420"/>
+        <w:jc w:val="both"/>
+        <w:rPr>
+          <w:rFonts w:ascii="Times New Roman" w:hAnsi="Times New Roman" w:eastAsia="宋体" w:cs="Times New Roman"/>
+          <w:sz w:val="21"/>
+          <w:szCs w:val="21"/>
+        </w:rPr>
+      </w:pPr>
+      <w:r>
+        <w:rPr>
+          <w:rFonts w:ascii="Times New Roman" w:hAnsi="Times New Roman" w:eastAsia="宋体" w:cs="Times New Roman"/>
+          <w:sz w:val="21"/>
+          <w:szCs w:val="21"/>
+        </w:rPr>
+        <w:t xml:space="preserve">公式符号测量程序：~\.claude\tools\word_symbol_align_check.py（把文档导出 PDF 后运行，检查符号位置偏差）。</w:t>
+      </w:r>
+    </w:p>
+    <w:p>
+      <w:pPr>
+        <w:spacing w:line="240" w:lineRule="auto"/>
+        <w:ind w:firstLineChars="200" w:firstLine="420"/>
+        <w:jc w:val="both"/>
+        <w:rPr>
+          <w:rFonts w:ascii="Times New Roman" w:hAnsi="Times New Roman" w:eastAsia="宋体" w:cs="Times New Roman"/>
+          <w:sz w:val="21"/>
+          <w:szCs w:val="21"/>
+        </w:rPr>
+      </w:pPr>
+      <w:r>
+        <w:rPr>
+          <w:rFonts w:ascii="Times New Roman" w:hAnsi="Times New Roman" w:eastAsia="宋体" w:cs="Times New Roman"/>
+          <w:sz w:val="21"/>
+          <w:szCs w:val="21"/>
+        </w:rPr>
+        <w:t xml:space="preserve">公式符号大小修复程序：~\.claude\tools\word_inline_eq_resize.py（需要时使用）。</w:t>
+      </w:r>
+    </w:p>
+    <w:p>
+      <w:pPr>
+        <w:spacing w:line="240" w:lineRule="auto"/>
+        <w:ind w:firstLineChars="200" w:firstLine="420"/>
+        <w:jc w:val="both"/>
+        <w:rPr>
+          <w:rFonts w:ascii="Times New Roman" w:hAnsi="Times New Roman" w:eastAsia="宋体" w:cs="Times New Roman"/>
+          <w:sz w:val="21"/>
+          <w:szCs w:val="21"/>
+        </w:rPr>
+      </w:pPr>
+      <w:r>
+        <w:rPr>
+          <w:rFonts w:ascii="Times New Roman" w:hAnsi="Times New Roman" w:eastAsia="宋体" w:cs="Times New Roman"/>
+          <w:sz w:val="21"/>
+          <w:szCs w:val="21"/>
+        </w:rPr>
+        <w:t xml:space="preserve">个人习惯档案：~\.claude\user-profile\（说话习惯、词语小词典、图片偏好、任务习惯四本，每次对话自动加载）。</w:t>
+      </w:r>
+    </w:p>
+    <w:p>
+      <w:pPr>
+        <w:spacing w:line="240" w:lineRule="auto"/>
+        <w:ind w:firstLineChars="200" w:firstLine="420"/>
+        <w:jc w:val="both"/>
+        <w:rPr>
+          <w:rFonts w:ascii="Times New Roman" w:hAnsi="Times New Roman" w:eastAsia="宋体" w:cs="Times New Roman"/>
+          <w:sz w:val="21"/>
+          <w:szCs w:val="21"/>
+        </w:rPr>
+      </w:pPr>
+      <w:r>
+        <w:rPr>
+          <w:rFonts w:ascii="Times New Roman" w:hAnsi="Times New Roman" w:eastAsia="宋体" w:cs="Times New Roman"/>
+          <w:sz w:val="21"/>
+          <w:szCs w:val="21"/>
+        </w:rPr>
+        <w:t xml:space="preserve">你的文档文件夹（每次改动前都会备份）。</w:t>
+      </w:r>
+    </w:p>
+    <w:p>
+      <w:pPr>
+        <w:spacing w:line="240" w:lineRule="auto"/>
+        <w:ind w:firstLineChars="0" w:firstLine="0"/>
+        <w:rPr>
+          <w:rFonts w:ascii="Times New Roman" w:hAnsi="Times New Roman" w:eastAsia="宋体" w:cs="Times New Roman"/>
+          <w:b/>
+          <w:bCs/>
+          <w:sz w:val="21"/>
+          <w:szCs w:val="21"/>
+        </w:rPr>
+      </w:pPr>
+      <w:r>
+        <w:rPr>
+          <w:rFonts w:ascii="Times New Roman" w:hAnsi="Times New Roman" w:eastAsia="宋体" w:cs="Times New Roman"/>
+          <w:b/>
+          <w:bCs/>
+          <w:sz w:val="21"/>
+          <w:szCs w:val="21"/>
+        </w:rPr>
+        <w:t xml:space="preserve">七、还没有特别规定的事项（您可以随时补充，我再加进标准）</w:t>
       </w:r>
     </w:p>
     <w:p>

</xml_diff>